<commit_message>
Improve Plant-CellFM submission readiness evidence
</commit_message>
<xml_diff>
--- a/manuscript/Plant_CellFM_v9_cover_letter.docx
+++ b/manuscript/Plant_CellFM_v9_cover_letter.docx
@@ -27,7 +27,7 @@
           <w:b w:val="0"/>
           <w:sz w:val="21"/>
         </w:rPr>
-        <w:t>Generated: `2026-07-30 21:35 Asia/Shanghai`</w:t>
+        <w:t>Generated: `2026-07-31 01:07 Asia/Shanghai`</w:t>
       </w:r>
     </w:p>
     <w:p>
@@ -105,7 +105,7 @@
           <w:b w:val="0"/>
           <w:sz w:val="21"/>
         </w:rPr>
-        <w:t>Third, the submission includes a completed Seurat label-transfer comparator, classical centroid baselines and a v3 comparison. scPlantLLM and scPlantAnnotate are disclosed at their auditable execution boundaries because official executable weights or authenticated batch access are not yet fully closed in the release environment. We therefore do not claim final numerical superiority over those tools.</w:t>
+        <w:t>Third, the open-set calibration audit adds a practical use layer for this strict benchmark. The deployed API annotation head reaches 96.64% selective accuracy when automatically accepting the top 30% fine-confidence cells and 92.81% at the top 40% acceptance level. Lower-confidence and open-set-like cells are routed to manual review, ontology harmonization or species-adapter calibration rather than being converted directly into biological claims.</w:t>
       </w:r>
     </w:p>
     <w:p>
@@ -118,7 +118,33 @@
           <w:b w:val="0"/>
           <w:sz w:val="21"/>
         </w:rPr>
-        <w:t>Fourth, the Arabidopsis root case demonstrates biological use of the model output. The case contains 260 marker-candidate rows across 13 cell states and 10 root-identity states, linking adapter resolution, hierarchical annotation and marker-candidate mining in a public-data plant root setting.</w:t>
+        <w:t>Fourth, the submission includes a completed Seurat label-transfer comparator, classical centroid baselines and a v3 comparison. scPlantLLM and scPlantAnnotate are disclosed through official-source benchmark contracts with input packages, runner commands, missing artifacts and metric-closure rules. We therefore do not claim final numerical superiority over those tools until executable official metrics are frozen.</w:t>
+      </w:r>
+    </w:p>
+    <w:p>
+      <w:pPr>
+        <w:spacing w:line="276" w:lineRule="auto" w:after="120"/>
+      </w:pPr>
+      <w:r>
+        <w:rPr>
+          <w:rFonts w:ascii="Arial" w:hAnsi="Arial"/>
+          <w:b w:val="0"/>
+          <w:sz w:val="21"/>
+        </w:rPr>
+        <w:t>Fifth, the Arabidopsis root and multi-species scPlantDB cases demonstrate biological use of the model output. The Arabidopsis case contains 260 marker-candidate rows across 13 cell states and 10 root-identity states, linking adapter resolution, hierarchical annotation and marker-candidate mining in a public-data plant root setting.</w:t>
+      </w:r>
+    </w:p>
+    <w:p>
+      <w:pPr>
+        <w:spacing w:line="276" w:lineRule="auto" w:after="120"/>
+      </w:pPr>
+      <w:r>
+        <w:rPr>
+          <w:rFonts w:ascii="Arial" w:hAnsi="Arial"/>
+          <w:b w:val="0"/>
+          <w:sz w:val="21"/>
+        </w:rPr>
+        <w:t xml:space="preserve"> The multi-species scPlantDB case adds 31,503 cells, 4 species, 4 tissues and 96 marker-candidate records as a second public-data biology demonstration.</w:t>
       </w:r>
     </w:p>
     <w:p>

</xml_diff>

<commit_message>
Add species-transfer calibration benchmark
</commit_message>
<xml_diff>
--- a/manuscript/Plant_CellFM_v9_cover_letter.docx
+++ b/manuscript/Plant_CellFM_v9_cover_letter.docx
@@ -27,7 +27,7 @@
           <w:b w:val="0"/>
           <w:sz w:val="21"/>
         </w:rPr>
-        <w:t>Generated: `2026-07-31 01:07 Asia/Shanghai`</w:t>
+        <w:t>Generated: `2026-07-31 02:04 Asia/Shanghai`</w:t>
       </w:r>
     </w:p>
     <w:p>
@@ -105,7 +105,7 @@
           <w:b w:val="0"/>
           <w:sz w:val="21"/>
         </w:rPr>
-        <w:t>Third, the open-set calibration audit adds a practical use layer for this strict benchmark. The deployed API annotation head reaches 96.64% selective accuracy when automatically accepting the top 30% fine-confidence cells and 92.81% at the top 40% acceptance level. Lower-confidence and open-set-like cells are routed to manual review, ontology harmonization or species-adapter calibration rather than being converted directly into biological claims.</w:t>
+        <w:t>Third, the new Species-Transfer Calibration layer adds an explicit algorithmic improvement on the same frozen embeddings and leave-species split. Without training on held-out species labels, the calibrated `knn_cosine_k9` layer improves exact-label all-cell accuracy from 23.64% to 30.10%, known-label accuracy from 42.28% to 53.84%, and known-label macro-F1 from 0.1922 to 0.2663. Coverage remains 55.90%, so the gain reflects classifier calibration rather than changing the denominator.</w:t>
       </w:r>
     </w:p>
     <w:p>
@@ -118,7 +118,7 @@
           <w:b w:val="0"/>
           <w:sz w:val="21"/>
         </w:rPr>
-        <w:t>Fourth, the submission includes a completed Seurat label-transfer comparator, classical centroid baselines and a v3 comparison. scPlantLLM and scPlantAnnotate are disclosed through official-source benchmark contracts with input packages, runner commands, missing artifacts and metric-closure rules. We therefore do not claim final numerical superiority over those tools until executable official metrics are frozen.</w:t>
+        <w:t>Fourth, the open-set calibration audit adds a practical use layer for this strict benchmark. The deployed API annotation head reaches 96.64% selective accuracy when automatically accepting the top 30% fine-confidence cells and 92.81% at the top 40% acceptance level. Lower-confidence and open-set-like cells are routed to manual review, ontology harmonization or species-adapter calibration rather than being converted directly into biological claims.</w:t>
       </w:r>
     </w:p>
     <w:p>
@@ -131,7 +131,20 @@
           <w:b w:val="0"/>
           <w:sz w:val="21"/>
         </w:rPr>
-        <w:t>Fifth, the Arabidopsis root and multi-species scPlantDB cases demonstrate biological use of the model output. The Arabidopsis case contains 260 marker-candidate rows across 13 cell states and 10 root-identity states, linking adapter resolution, hierarchical annotation and marker-candidate mining in a public-data plant root setting.</w:t>
+        <w:t>Fifth, the submission includes a completed Seurat label-transfer comparator, classical centroid baselines and a v3 comparison. scPlantLLM and scPlantAnnotate are disclosed through official-source benchmark contracts with input packages, runner commands, missing artifacts and metric-closure rules. We therefore do not claim final numerical superiority over those tools until executable official metrics are frozen.</w:t>
+      </w:r>
+    </w:p>
+    <w:p>
+      <w:pPr>
+        <w:spacing w:line="276" w:lineRule="auto" w:after="120"/>
+      </w:pPr>
+      <w:r>
+        <w:rPr>
+          <w:rFonts w:ascii="Arial" w:hAnsi="Arial"/>
+          <w:b w:val="0"/>
+          <w:sz w:val="21"/>
+        </w:rPr>
+        <w:t>Sixth, the Arabidopsis root and multi-species scPlantDB cases demonstrate biological use of the model output. The Arabidopsis case contains 260 marker-candidate rows across 13 cell states and 10 root-identity states, linking adapter resolution, hierarchical annotation and marker-candidate mining in a public-data plant root setting.</w:t>
       </w:r>
     </w:p>
     <w:p>

</xml_diff>